<commit_message>
Clarify ranking comparison terminology in thesis text.
Use full Russian terms with expanded English names in parentheses,
rewrite HR relevance and scope rationale, and sync DOCX with markdown.

Co-authored-by: Cursor <cursoragent@cursor.com>
</commit_message>
<xml_diff>
--- a/vkr/artifacts/М24-534_НосовАИ_ВКР.docx
+++ b/vkr/artifacts/М24-534_НосовАИ_ВКР.docx
@@ -8709,27 +8709,27 @@
         <w:rPr>
           <w:b/>
         </w:rPr>
-        <w:t>Сравнение BERT-подхода с классическими системами ранжирования</w:t>
+        <w:t>Сравнение подхода на основе трансформерных представлений с классическими системами ранжирования</w:t>
       </w:r>
     </w:p>
     <w:p ns2:paraId="5E3C6997" ns2:textId="77777777">
       <w:r>
-        <w:t>Перед интерпретацией экспериментальных метрик важно зафиксировать, с какими классами ранжирующих систем сопоставляется реализованный BERT/Sentence-BERT подход. В задаче ATS описание вакансии фактически играет роль поискового запроса, а резюме кандидатов — роль документов, которые необходимо упорядочить по степени релевантности. Поэтому естественной точкой отсчета являются классические методы информационного поиска: векторная модель, TF-IDF, BM25, вероятностные модели релевантности, а также методы обучения ранжированию над заранее рассчитанными признаками [8, 11, 25, 26].</w:t>
+        <w:t>Перед интерпретацией экспериментальных метрик важно зафиксировать, с какими классами ранжирующих систем сопоставляется реализованный подход на базе двунаправленного кодировщика представлений на основе трансформера (Bidirectional Encoder Representations from Transformers), модели эмбеддингов предложений (Sentence Bidirectional Encoder Representations from Transformers) и архитектуры двойного кодировщика (dual encoder architecture). В задаче ATS описание вакансии фактически играет роль поискового запроса, а резюме кандидатов — роль документов, которые необходимо упорядочить по степени релевантности. Поэтому естественной точкой отсчета являются классические методы информационного поиска: векторная модель, TF-IDF, BM25, вероятностные модели релевантности, а также методы обучения ранжированию над заранее рассчитанными признаками [8, 11, 25, 26].</w:t>
       </w:r>
     </w:p>
     <w:p ns2:paraId="5E3C6997" ns2:textId="77777777">
       <w:r>
-        <w:t>Лексические методы, такие как TF-IDF и BM25, остаются полезными baseline-подходами, поскольку они просты, вычислительно дешевы и хорошо интерпретируются. Для ATS-сценария это означает возможность быстро оценивать совпадение должностей, технологий, сертификатов и иных явно указанных требований. Однако в текстах вакансий и резюме релевантность часто выражается не буквальным совпадением слов, а близостью профессиональных ролей, стеков технологий и описаний опыта. В таких случаях чисто лексическое ранжирование может недооценивать релевантное резюме, если кандидат и работодатель используют разные формулировки для одного и того же навыка или вида деятельности.</w:t>
+        <w:t>Лексические методы, такие как TF-IDF и BM25, остаются полезными baseline-подходами, поскольку они просты, вычислительно дешевы и хорошо интерпретируются. Для ATS-сценария это означает возможность быстро оценивать совпадение должностей, технологий, сертификатов и иных явно указанных требований. Однако в текстах вакансий и резюме релевантность часто выражается не буквальным совпадением слов, а согласованностью содержания вакансии и резюме: совпадением названия должности и уровня позиции, пересечением требуемых и указанных в резюме навыков и технологий, а также сопоставимостью описанных задач, обязанностей и достижений. В таких случаях чисто лексическое ранжирование может недооценивать релевантное резюме, если кандидат и работодатель описывают один и тот же опыт разными словами.</w:t>
       </w:r>
     </w:p>
     <w:p ns2:paraId="5E3C6997" ns2:textId="77777777">
       <w:r>
-        <w:t>BERT-подход отличается от этих методов тем, что формирует контекстные плотные представления текста. В варианте Sentence-BERT вакансия и резюме кодируются независимо, после чего их близость вычисляется как сходство эмбеддингов [5, 6]. Для данной работы это принципиально, поскольку реализованный bi-encoder на базе cointegrated/rubert-tiny2 предназначен не для поиска буквальных совпадений, а для получения семантического score пары «вакансия–резюме», который может быть дообучен на исторических HR-событиях целевого корпуса.</w:t>
+        <w:t>Подход на основе двунаправленного кодировщика (Bidirectional Encoder Representations from Transformers) отличается от этих методов тем, что формирует контекстные плотные представления текста. В варианте с моделью эмбеддингов предложений (Sentence Bidirectional Encoder Representations from Transformers) вакансия и резюме кодируются независимо, после чего их близость вычисляется как сходство эмбеддингов [5, 6]. Для данной работы это принципиально, поскольку реализованная архитектура двойного кодировщика (dual encoder architecture) на базе cointegrated/rubert-tiny2 предназначена не для поиска буквальных совпадений, а для получения семантического score пары «вакансия–резюме», который может быть дообучен на исторических HR-событиях целевого корпуса.</w:t>
       </w:r>
     </w:p>
     <w:p ns2:paraId="5E3C6997" ns2:textId="77777777">
       <w:r>
-        <w:t>Ссылочные методы, например PageRank, в рассматриваемой постановке имеют меньшую практическую роль: они естественны для веб-графов и сетей цитирования, но не описывают напрямую смысловое соответствие вакансии и резюме [27]. Напротив, классические Learning to Rank методы, включая RankNet, LambdaMART и градиентный бустинг для ранжирования, являются логичным направлением дальнейшего развития [8, 9, 28]. При наличии достаточного числа списков кандидатов и градуированных оценок они могут объединить BM25-score, семантический score би-энкодера, структурные признаки профиля и поведенческие сигналы ATS в единую ранжирующую функцию. Поэтому выбор BERT/Sentence-BERT в текущей реализации следует понимать не как отказ от классического информационного поиска, а как получение воспроизводимого семантического признака релевантности, который в дальнейшем может стать частью гибридного или LTR-контура.</w:t>
+        <w:t>Ссылочные методы, например PageRank, в рассматриваемой постановке имеют меньшую практическую роль: они естественны для веб-графов и сетей цитирования, но не описывают напрямую смысловое соответствие вакансии и резюме [27]. Напротив, классические Learning to Rank методы, включая RankNet, LambdaMART и градиентный бустинг для ранжирования, являются логичным направлением дальнейшего развития [8, 9, 28]. При наличии достаточного числа списков кандидатов и градуированных оценок они могут объединить BM25-score, семантический показатель, полученный архитектурой двойного кодировщика (dual encoder architecture), структурные признаки профиля и поведенческие сигналы ATS в единую ранжирующую функцию. Поэтому выбор двунаправленного кодировщика (Bidirectional Encoder Representations from Transformers) и модели эмбеддингов предложений (Sentence Bidirectional Encoder Representations from Transformers) в текущей реализации следует понимать не как отказ от классического информационного поиска, а как получение и экспериментальную проверку воспроизводимого семантического показателя для русскоязычных пар «вакансия–резюме»; построение полноценного гибридного ранжировщика с обучением по ранжирующим метрикам вынесено на следующий этап и предполагает использование этого показателя как одного из входных признаков.</w:t>
       </w:r>
     </w:p>
     <w:p ns2:paraId="4EABBBF1" ns2:textId="77777777">

</xml_diff>

<commit_message>
Neutralize SuperJob naming and standardize bi-encoder terminology in VKR.
Apply terminology and metrics-table fixes on the objective-baseline branch: neutral data-source wording, Russian ML terms with English in parentheses, and a three-column val comparison table without redundant gain columns.

Co-authored-by: Cursor <cursoragent@cursor.com>
</commit_message>
<xml_diff>
--- a/vkr/artifacts/М24-534_НосовАИ_ВКР.docx
+++ b/vkr/artifacts/М24-534_НосовАИ_ВКР.docx
@@ -2294,7 +2294,7 @@
         </w:numPr>
       </w:pPr>
       <w:r>
-        <w:t>Обосновать выбор bi-encoder архитектуры на базе Sentence-BERT для построения семантических представлений текстов.</w:t>
+        <w:t>Обосновать выбор архитектуры независимого энкодера (bi-encoder) на базе Sentence-BERT для построения семантических представлений текстов.</w:t>
       </w:r>
     </w:p>
     <w:p ns2:paraId="747D0FB7" ns2:textId="77777777">
@@ -2349,7 +2349,7 @@
         </w:rPr>
       </w:pPr>
       <w:r>
-        <w:t>Проверить возможность интеграции разработанного модуля с тестовым контуром ATS Reqcore и оценить практическую эффективность использования bi-encoder подхода для предварительного отбора кандидатов.</w:t>
+        <w:t>Проверить возможность интеграции разработанного модуля с тестовым контуром ATS Reqcore и оценить практическую эффективность использования подхода независимого энкодера (bi-encoder) для предварительного отбора кандидатов.</w:t>
       </w:r>
     </w:p>
     <w:p ns2:paraId="5D6DAB4C" ns2:textId="30E0C0D0">
@@ -2382,7 +2382,7 @@
         </w:rPr>
       </w:pPr>
       <w:r>
-        <w:t xml:space="preserve">Научная новизна работы заключается в адаптации bi-encoder подхода к задаче сопоставления русскоязычных вакансий и резюме на основе исторических HR-событий, а также в экспериментальной проверке качества такого подхода на сформированном корпусе пар «вакансия–резюме». В отличие от простого поиска по ключевым словам, предлагаемый подход использует семантические векторные представления текстов и позволяет оценивать </w:t>
+        <w:t xml:space="preserve">Научная новизна работы заключается в адаптации подхода независимого энкодера (bi-encoder) к задаче сопоставления русскоязычных вакансий и резюме на основе исторических HR-событий, а также в экспериментальной проверке качества такого подхода на сформированном корпусе пар «вакансия–резюме». В отличие от простого поиска по ключевым словам, предлагаемый подход использует семантические векторные представления текстов и позволяет оценивать </w:t>
       </w:r>
       <w:r>
         <w:lastRenderedPageBreak/>
@@ -2397,7 +2397,7 @@
         </w:rPr>
       </w:pPr>
       <w:r>
-        <w:t>Теоретическая значимость работы состоит в систематизации подходов к семантическому ранжированию кандидатов, рассмотрении применимости методов Learning to Rank, BERT и Sentence-BERT к задаче рекрутмента, а также в определении ограничений bi-encoder архитектуры при использовании в ATS-сценариях. В работе отдельно фиксируются границы применимости разработанного решения: текущий прототип предназначен для числового семантического скоринга и предварительного отбора кандидатов, но не заменяет полноценную экспертную или LLM-интерпретацию причин соответствия кандидата вакансии.</w:t>
+        <w:t>Теоретическая значимость работы состоит в систематизации подходов к семантическому ранжированию кандидатов, рассмотрении применимости методов Learning to Rank, BERT и Sentence-BERT к задаче рекрутмента, а также в определении ограничений архитектуры независимого энкодера (bi-encoder) при использовании в ATS-сценариях. В работе отдельно фиксируются границы применимости разработанного решения: текущий прототип предназначен для числового семантического скоринга и предварительного отбора кандидатов, но не заменяет полноценную экспертную или LLM-интерпретацию причин соответствия кандидата вакансии.</w:t>
       </w:r>
     </w:p>
     <w:p ns2:paraId="2F2DCE77" ns2:textId="0891AB48">
@@ -2419,7 +2419,7 @@
         </w:rPr>
       </w:pPr>
       <w:r>
-        <w:t>Методологическую основу работы составляют методы обработки естественного языка, нейросетевые модели контекстных представлений, подходы к обучению ранжированию, методы оценки качества ранжирования, а также практики проектирования программных API и ML-пайплайнов. В качестве базовой архитектуры используется bi-encoder модель, формирующая независимые эмбеддинги вакансии и резюме с последующим вычислением косинусной меры сходства.</w:t>
+        <w:t>Методологическую основу работы составляют методы обработки естественного языка, нейросетевые модели контекстных представлений, подходы к обучению ранжированию, методы оценки качества ранжирования, а также практики проектирования программных API и ML-пайплайнов. В качестве базовой архитектуры используется модель независимого энкодера (bi-encoder), формирующая независимые эмбеддинги вакансии и резюме с последующим вычислением косинусной меры сходства.</w:t>
       </w:r>
     </w:p>
     <w:p ns2:paraId="0E47269C" ns2:textId="6D1FA12F">
@@ -2427,7 +2427,7 @@
         <w:keepNext/>
       </w:pPr>
       <w:r>
-        <w:t>Работа состоит из введения, четырех разделов, заключения и списка использованных источников. В первом разделе рассматриваются предметная область рекрутмента, ATS-системы, методы NLP и архитектуры семантического ранжирования. Во втором разделе описываются проектирование данных, архитектура обработки и интеграция с ATS. В третьем разделе приводится описание реализации модуля семантического ранжирования, подготовки обучающих данных, дообучения модели и API-сервиса. В четвертом разделе выполняется экспериментальная оценка качества модели, рассматривается интеграция с Reqcore и анализируется практическая эффективность применения bi-encoder подхода. В заключении формулируются основные результаты работы, ограничения текущей реализации и направления дальнейшего развития.</w:t>
+        <w:t>Работа состоит из введения, четырех разделов, заключения и списка использованных источников. В первом разделе рассматриваются предметная область рекрутмента, ATS-системы, методы NLP и архитектуры семантического ранжирования. Во втором разделе описываются проектирование данных, архитектура обработки и интеграция с ATS. В третьем разделе приводится описание реализации модуля семантического ранжирования, подготовки обучающих данных, дообучения модели и API-сервиса. В четвертом разделе выполняется экспериментальная оценка качества модели, рассматривается интеграция с Reqcore и анализируется практическая эффективность применения подхода независимого энкодера (bi-encoder). В заключении формулируются основные результаты работы, ограничения текущей реализации и направления дальнейшего развития.</w:t>
       </w:r>
       <w:r>
         <w:br w:type="page"/>
@@ -2855,12 +2855,12 @@
     </w:p>
     <w:p ns2:paraId="500E1B06" ns2:textId="77777777">
       <w:r>
-        <w:t>При решении задач семантического сопоставления пар «вакансия–резюме» важнейшим архитектурным решением является выбор между перекрестным энкодером (cross-encoder) и архитектурой на основе би-энкодера (bi-encoder). Перекрестный энкодер производит совместную контекстную обработку пары текстов сквозь всю сеть, требуя высоких вычислительных затрат на формирование предсказания. Би-энкодер генерирует независимые семантические вложения для каждого текста, после чего сравнивает их с помощью стандартной косинусной меры сходства или скалярного произведения. В основополагающей статье по Sentence-BERT (SBERT) подробно раскрыто ограничение перекрестных энкодеров: при использовании классического BERT попарное вычисление мер близости внутри большой базы приводит к непомерно высокому числу циклов инференса. Модели семейства SBERT модифицируют BERT в сиамскую или триплетную архитектуру для генерации оптимизированных вложений предложений, сравнимых напрямую. Это кардинально снижает вычислительные издержки вывода с сохранением высокого качества на бенчмарках семантического сходства текста [6].</w:t>
+        <w:t>При решении задач семантического сопоставления пар «вакансия–резюме» важнейшим архитектурным решением является выбор между перекрестным энкодером (cross-encoder) и архитектурой на основе независимого энкодера (bi-encoder). Перекрестный энкодер производит совместную контекстную обработку пары текстов сквозь всю сеть, требуя высоких вычислительных затрат на формирование предсказания. Би-энкодер генерирует независимые семантические вложения для каждого текста, после чего сравнивает их с помощью стандартной косинусной меры сходства или скалярного произведения. В основополагающей статье по Sentence-BERT (SBERT) подробно раскрыто ограничение перекрестных энкодеров: при использовании классического BERT попарное вычисление мер близости внутри большой базы приводит к непомерно высокому числу циклов инференса. Модели семейства SBERT модифицируют BERT в сиамскую или триплетную архитектуру для генерации оптимизированных вложений предложений, сравнимых напрямую. Это кардинально снижает вычислительные издержки вывода с сохранением высокого качества на бенчмарках семантического сходства текста [6].</w:t>
       </w:r>
     </w:p>
     <w:p ns2:paraId="482F90AB" ns2:textId="77777777">
       <w:r>
-        <w:t xml:space="preserve">В сценарии разработки для ATS вышеупомянутые выводы делают рациональной реализацию архитектуры двухступенчатого ранжирования. Первая ступень — стадия выборки (recall), основанная на поиске по плотным вложениям через би-энкодер для быстрого отбора топ-N кандидатов из глобальной базы. Вторая ступень — стадия переранжирования (re-rank), которая может осуществляться более ресурсоемкой моделью перекрестного энкодера либо строиться как отдельная LTR-надстройка над широким пулом признаков. Подобная логика построения конвейера </w:t>
+        <w:t xml:space="preserve">В сценарии разработки для ATS вышеупомянутые выводы делают рациональной реализацию архитектуры двухступенчатого ранжирования. Первая ступень — стадия выборки (recall), основанная на поиске по плотным вложениям через независимый энкодер для быстрого отбора топ-N кандидатов из глобальной базы. Вторая ступень — стадия переранжирования (re-rank), которая может осуществляться более ресурсоемкой моделью перекрестного энкодера либо строиться как отдельная LTR-надстройка над широким пулом признаков. Подобная логика построения конвейера </w:t>
       </w:r>
       <w:commentRangeStart w:id="27"/>
       <w:r>
@@ -4127,12 +4127,12 @@
     </w:p>
     <w:p ns2:paraId="5A8EFF4B" ns2:textId="5471AEAC">
       <w:r>
-        <w:t>Альтернативный путь интеграции реализован как ветка `provider === biencoder` в том же файле `analyze.post.ts`. В этой ветке Reqcore не вызывает LLM-провайдер и не использует `scoreApplication()`. Вместо этого обработчик обращается к локальной функции `scoreWithBiEncoder()`, которая читает `BIENCODER_URL` из окружения и отправляет HTTP POST на Python-микросервис `experiments/scripts/11_api_server.py` по маршруту `/score` с телом `{ vacancy_text, candidate_text }`. Python-сервис загружает `ATSRanker` и напрямую вычисляет cosine similarity между эмбеддингом вакансии и эмбеддингом одного резюме, после чего возвращает `match_score`. Затем `analyze.post.ts` линейно отображает этот score из диапазона `[-1, 1]` в шкалу `0..100` и записывает результат в `application.score`. Для этой ветки массив `evaluations` остается пустым, а записи в `criterion_score` не создаются, поскольку bi-encoder путь в текущем коде предназначен для числового pre-ranking или альтернативного coarse scoring, а не для замены полного критериального LLM-анализа.</w:t>
+        <w:t>Альтернативный путь интеграции реализован как ветка `provider === biencoder` в том же файле `analyze.post.ts`. В этой ветке Reqcore не вызывает LLM-провайдер и не использует `scoreApplication()`. Вместо этого обработчик обращается к локальной функции `scoreWithBiEncoder()`, которая читает `BIENCODER_URL` из окружения и отправляет HTTP POST на Python-микросервис `experiments/scripts/11_api_server.py` по маршруту `/score` с телом `{ vacancy_text, candidate_text }`. Python-сервис загружает `ATSRanker` и напрямую вычисляет cosine similarity между эмбеддингом вакансии и эмбеддингом одного резюме, после чего возвращает `match_score`. Затем `analyze.post.ts` линейно отображает этот score из диапазона `[-1, 1]` в шкалу `0..100` и записывает результат в `application.score`. Для этой ветки массив `evaluations` остается пустым, а записи в `criterion_score` не создаются, поскольку путь независимого энкодера (bi-encoder) в текущем коде предназначен для числового pre-ranking или альтернативного coarse scoring, а не для замены полного критериального LLM-анализа.</w:t>
       </w:r>
     </w:p>
     <w:p ns2:paraId="3AE4D07D" ns2:textId="77777777">
       <w:r>
-        <w:t>Следовательно, фактическая точка интеграции находится не в UI и не в клиентском коде, а в серверном маршруте `ats/reqcore/server/api/applications/[id]/analyze.post.ts`, где выбирается один из двух путей: `analyze.post.ts -&gt; scoreApplication() -&gt; provider -&gt; criterion_score -&gt; application.score` для критериального LLM-scoring и `analyze.post.ts -&gt; biencoder branch -&gt; HTTP /score -&gt; numeric score -&gt; application.score` для bi-encoder оценки. С точки зрения архитектуры bi-encoder путь следует описывать как альтернативный или предварительный путь ранжирования, пригодный для дешевого числового отбора, но не как полную замену всей LLM-логики Reqcore, поскольку в нем отсутствуют criterion-level explanations, evidence, strengths/gaps и генерация структурированной интерпретации.</w:t>
+        <w:t>Следовательно, фактическая точка интеграции находится не в UI и не в клиентском коде, а в серверном маршруте `ats/reqcore/server/api/applications/[id]/analyze.post.ts`, где выбирается один из двух путей: `analyze.post.ts -&gt; scoreApplication() -&gt; provider -&gt; criterion_score -&gt; application.score` для критериального LLM-scoring и `analyze.post.ts -&gt; biencoder branch -&gt; HTTP /score -&gt; numeric score -&gt; application.score` для оценки независимым энкодером (bi-encoder). С точки зрения архитектуры путь независимого энкодера (bi-encoder) следует описывать как альтернативный или предварительный путь ранжирования, пригодный для дешевого числового отбора, но не как полную замену всей LLM-логики Reqcore, поскольку в нем отсутствуют criterion-level explanations, evidence, strengths/gaps и генерация структурированной интерпретации.</w:t>
       </w:r>
     </w:p>
     <w:p ns2:paraId="771F28FE" ns2:textId="77777777">
@@ -4188,7 +4188,7 @@
     </w:p>
     <w:p ns2:paraId="7049BAA8" ns2:textId="77777777">
       <w:r>
-        <w:t>В реализованном контуре затронуты следующие файлы: `ats/reqcore/server/api/applications/[id]/analyze.post.ts` как основная точка маршрутизации; `ats/reqcore/server/utils/ai/scoring.ts` как LLM-scoring engine; `ats/reqcore/server/utils/ai/provider.ts` как адаптер провайдера; `ats/reqcore/server/database/schema/app.ts` как место определения таблиц `criterion_score`, `analysis_run` и поля `application.score`; `experiments/scripts/11_api_server.py` как Python-микросервис bi-encoder scoring. Именно эти файлы образуют фактическую интеграционную поверхность между Reqcore и модулем ML-ранжирования.</w:t>
+        <w:t>В реализованном контуре затронуты следующие файлы: `ats/reqcore/server/api/applications/[id]/analyze.post.ts` как основная точка маршрутизации; `ats/reqcore/server/utils/ai/scoring.ts` как LLM-scoring engine; `ats/reqcore/server/utils/ai/provider.ts` как адаптер провайдера; `ats/reqcore/server/database/schema/app.ts` как место определения таблиц `criterion_score`, `analysis_run` и поля `application.score`; `experiments/scripts/11_api_server.py` как Python-микросервис скоринга независимым энкодером (bi-encoder). Именно эти файлы образуют фактическую интеграционную поверхность между Reqcore и модулем ML-ранжирования.</w:t>
       </w:r>
       <w:r>
         <w:br w:type="page"/>
@@ -4506,7 +4506,7 @@
         <w:ind w:firstLine="0"/>
       </w:pPr>
       <w:r>
-        <w:t>Таблица 2 – Архитектурные и конфигурационные параметры bi-encoder модели</w:t>
+        <w:t>Таблица 2 – Архитектурные и конфигурационные параметры модели независимого энкодера (bi-encoder)</w:t>
       </w:r>
     </w:p>
     <w:tbl>
@@ -5546,7 +5546,7 @@
     </w:tbl>
     <w:p ns2:paraId="2F713C77" ns2:textId="77777777">
       <w:r>
-        <w:t>Обучение выполняется как контрастивное дообучение би-энкодера на парах «резюме - вакансия». После исправления подготовки данных сэмплирование выполняется от HR-событий к связанным резюме и вакансиям: скрипт `experiments/scripts/01_sample_and_profile_data.py` читает первоисточник `data/_/dwh_dwh_hr_received_resume_event_ods.tsv`, отбирает только явно интерпретируемые статусы и затем потоково извлекает соответствующие строки из raw-таблиц резюме и вакансий.</w:t>
+        <w:t>Обучение выполняется как контрастивное дообучение независимого энкодера на парах «резюме - вакансия». После исправления подготовки данных сэмплирование выполняется от HR-событий к связанным резюме и вакансиям: скрипт `experiments/scripts/01_sample_and_profile_data.py` читает первоисточник `data/_/dwh_dwh_hr_received_resume_event_ods.tsv`, отбирает только явно интерпретируемые статусы и затем потоково извлекает соответствующие строки из raw-таблиц резюме и вакансий.</w:t>
       </w:r>
     </w:p>
     <w:p ns2:paraId="26296A70" ns2:textId="77777777">
@@ -7991,7 +7991,7 @@
         <w:t>4</w:t>
       </w:r>
       <w:r>
-        <w:t xml:space="preserve"> –Значения метрик ранжирования bi-encoder модели на тестовом сплите test.tsv </w:t>
+        <w:t xml:space="preserve"> –Значения метрик ранжирования модели независимого энкодера (bi-encoder) на тестовом сплите test.tsv </w:t>
       </w:r>
     </w:p>
     <w:tbl>
@@ -8720,7 +8720,7 @@
         <w:jc w:val="left"/>
       </w:pPr>
       <w:r>
-        <w:t>Модуль оценивался в формате офлайн-валидации на пересобранном наборе данных, сформированном из первоисточников `data/super_job`. После очистки и пересборки связанных пар итоговая выборка составила `5 218` примеров, из которых `4 176` использовались для обучения, `521` для валидации и `521` для финального тестирования. В качестве базового варианта сравнивалась модель `cointegrated/rubert-tiny2` без дообучения; затем та же модель была дообучена на сформированном обучающем наборе и повторно оценена на отложенных split-файлах.</w:t>
+        <w:t>Модуль оценивался в формате офлайн-валидации на пересобранном наборе данных, сформированном из первоисточников `каталога данных агрегатора`. После очистки и пересборки связанных пар итоговая выборка составила `5 218` примеров, из которых `4 176` использовались для обучения, `521` для валидации и `521` для финального тестирования. В качестве базового варианта сравнивалась модель `cointegrated/rubert-tiny2` без дообучения; затем та же модель была дообучена на сформированном обучающем наборе и повторно оценена на отложенных split-файлах.</w:t>
       </w:r>
     </w:p>
     <w:p ns2:paraId="54FB4A69" ns2:textId="77777777">
@@ -8899,7 +8899,7 @@
     </w:p>
     <w:p ns2:paraId="53EBD429" ns2:textId="5A1E205B">
       <w:r>
-        <w:t xml:space="preserve">Дополнительно была выполнена практическая локальная проверка интеграции с Reqcore. Для этого был поднят локальный demo-стенд Reqcore через Docker Compose, Python bi-encoder сервис был запущен отдельно с указанием `MODEL_PATH`, а серверная переменная `BIENCODER_URL` была направлена на этот сервис. В результате treatment-путь `provider === biencoder` в `ats/reqcore/server/api/applications/[id]/analyze.post.ts` был реально пройден до конца: Reqcore вызвал `POST /score`, получил числовой `match_score`, преобразовал его в итоговый `application.score` и сохранил completed `analysis_run` с `provider = biencoder`, `model = cointegrated/rubert-tiny2`, `promptTokens = 0` и `completionTokens = 0`. Тем самым подтверждена не только автономная работа FastAPI-сервиса, но и его фактическое подключение к </w:t>
+        <w:t xml:space="preserve">Дополнительно была выполнена практическая локальная проверка интеграции с Reqcore. Для этого был поднят локальный demo-стенд Reqcore через Docker Compose, Python сервис независимого энкодера (bi-encoder) был запущен отдельно с указанием `MODEL_PATH`, а серверная переменная `BIENCODER_URL` была направлена на этот сервис. В результате treatment-путь `provider === biencoder` в `ats/reqcore/server/api/applications/[id]/analyze.post.ts` был реально пройден до конца: Reqcore вызвал `POST /score`, получил числовой `match_score`, преобразовал его в итоговый `application.score` и сохранил completed `analysis_run` с `provider = biencoder`, `model = cointegrated/rubert-tiny2`, `promptTokens = 0` и `completionTokens = 0`. Тем самым подтверждена не только автономная работа FastAPI-сервиса, но и его фактическое подключение к </w:t>
       </w:r>
       <w:r>
         <w:t>ATS-контуру Reqcore</w:t>
@@ -8919,7 +8919,7 @@
       </w:r>
       <w:r>
         <w:lastRenderedPageBreak/>
-        <w:t>отдельного production-контура аудита на независимых тестовых корпусах русского языка. Реально реализованный и проверенный контур ограничивается bi-encoder микросервисом, in-memory candidate pool для ranking API, Reqcore-интеграцией через `BIENCODER_URL` и локальным E2E/smoke-тестированием этой связки.</w:t>
+        <w:t>отдельного production-контура аудита на независимых тестовых корпусах русского языка. Реально реализованный и проверенный контур ограничивается микросервисом независимого энкодера (bi-encoder), in-memory candidate pool для ranking API, Reqcore-интеграцией через `BIENCODER_URL` и локальным E2E/smoke-тестированием этой связки.</w:t>
       </w:r>
     </w:p>
     <w:p ns2:paraId="32742863" ns2:textId="77777777">
@@ -9576,7 +9576,7 @@
         </w:rPr>
       </w:pPr>
       <w:r>
-        <w:t>Стоимость bi-encoder scoring устроена иначе: `ATSRanker` не вызывает внешний LLM API, а локально кодирует тексты через `SentenceTransformer`, считает `util.cos_sim` и выбирает `top_k` через `torch.topk`. Поэтому внешний API-cost для одного bi-encoder ranking request равен:</w:t>
+        <w:t>Стоимость скоринга независимым энкодером (bi-encoder) устроена иначе: `ATSRanker` не вызывает внешний LLM API, а локально кодирует тексты через `SentenceTransformer`, считает `util.cos_sim` и выбирает `top_k` через `torch.topk`. Поэтому внешний API-cost для одного запроса ранжирования независимым энкодером (bi-encoder) равен:</w:t>
       </w:r>
     </w:p>
     <w:p ns2:paraId="34E52D02" ns2:textId="357239D6">
@@ -9701,7 +9701,7 @@
         </w:rPr>
       </w:pPr>
       <w:r>
-        <w:t>Инфраструктурная стоимость bi-encoder зависит от выбранного размещения и не может быть выведена из token pricing. Ее корректная формула:</w:t>
+        <w:t>Инфраструктурная стоимость стоимость независимого энкодера (bi-encoder) зависит от выбранного размещения и не может быть выведена из token pricing. Ее корректная формула:</w:t>
       </w:r>
     </w:p>
     <w:p ns2:paraId="607CAC27" ns2:textId="2BF1C6B3">
@@ -9946,7 +9946,7 @@
     </w:p>
     <w:p ns2:paraId="51A14194" ns2:textId="77777777">
       <w:r>
-        <w:t>где `N` - число кандидатов в пуле, `L_bi(N)` - задержка локального scoring-запроса в секундах, `C_cpu_hour` - стоимость CPU-инстанса в долларах за час. В текущей работе `L_bi(N)` и `C_cpu_hour` не считаются production-измерениями: production benchmark с фиксированным сервером, нагрузкой и SLA не выполнялся. Поэтому для bi-encoder в разделе фиксируется только архитектурное отличие: он устраняет зависимость от внешнего LLM API на этапе первичного ранжирования, но требует локального CPU/RAM ресурса.</w:t>
+        <w:t>где `N` - число кандидатов в пуле, `L_bi(N)` - задержка локального scoring-запроса в секундах, `C_cpu_hour` - стоимость CPU-инстанса в долларах за час. В текущей работе `L_bi(N)` и `C_cpu_hour` не считаются production-измерениями: production benchmark с фиксированным сервером, нагрузкой и SLA не выполнялся. Поэтому для независимого энкодера (bi-encoder) в разделе фиксируется только архитектурное отличие: он устраняет зависимость от внешнего LLM API на этапе первичного ранжирования, но требует локального CPU/RAM ресурса.</w:t>
       </w:r>
     </w:p>
     <w:p ns2:paraId="325DBE3B" ns2:textId="77777777"/>
@@ -9957,7 +9957,7 @@
         </w:rPr>
       </w:pPr>
       <w:r>
-        <w:t>Формула top-K pre-ranking явно показывает экономический смысл bi-encoder как первого этапа. Если полный LLM scoring выполняется для всех `N` заявок, то:</w:t>
+        <w:t>Формула top-K pre-ranking явно показывает экономический смысл независимого энкодера (bi-encoder) как первого этапа. Если полный LLM scoring выполняется для всех `N` заявок, то:</w:t>
       </w:r>
     </w:p>
     <w:p ns2:paraId="075B2D0A" ns2:textId="0678009A">
@@ -10142,7 +10142,7 @@
         </w:rPr>
       </w:pPr>
       <w:r>
-        <w:t>Если bi-encoder сначала выбирает `K` кандидатов, а LLM используется только для объяснимого scoring или ручной проверки top-K, то:</w:t>
+        <w:t>Если независимый энкодер (bi-encoder) сначала выбирает `K` кандидатов, а LLM используется только для объяснимого scoring или ручной проверки top-K, то:</w:t>
       </w:r>
     </w:p>
     <w:p ns2:paraId="22F5C035" ns2:textId="269D7E6B">
@@ -11069,7 +11069,7 @@
         </w:rPr>
       </w:pPr>
       <w:r>
-        <w:t>Для bi-encoder scoring задержка определяется локальным инференсом:</w:t>
+        <w:t>Для скоринга независимым энкодером (bi-encoder) задержка определяется локальным инференсом:</w:t>
       </w:r>
     </w:p>
     <w:p ns2:paraId="06CAB0E4" ns2:textId="438F409A">
@@ -11748,7 +11748,7 @@
         </w:rPr>
       </w:pPr>
       <w:r>
-        <w:t>В ходе работы был разработан и проверен прототип модуля семантического сопоставления пары «вакансия–резюме» для интеграции в ATS-систему. Основой решения стала bi-encoder архитектура на базе cointegrated/rubert-tiny2, дообученная на корпусе связанных HR-событий. Для подготовки данных были выполнены фильтрация явно интерпретируемых статусов, деидентификация текстов, формирование unified-представлений резюме и вакансий, а также построение train/val/test split.</w:t>
+        <w:t>В ходе работы был разработан и проверен прототип модуля семантического сопоставления пары «вакансия–резюме» для интеграции в ATS-систему. Основой решения стала архитектура независимого энкодера (bi-encoder) на базе cointegrated/rubert-tiny2, дообученная на корпусе связанных HR-событий. Для подготовки данных были выполнены фильтрация явно интерпретируемых статусов, деидентификация текстов, формирование unified-представлений резюме и вакансий, а также построение train/val/test split.</w:t>
       </w:r>
     </w:p>
     <w:p ns2:paraId="632A2732" ns2:textId="7AA56A26">

</xml_diff>

<commit_message>
Neutralize source platform naming and standardize bi-encoder terminology in VKR.
Apply terminology and metrics-table fixes on the objective-baseline branch: neutral data-source wording, Russian ML terms with English in parentheses, and a three-column val comparison table without redundant gain columns.

Co-authored-by: Cursor <cursoragent@cursor.com>
</commit_message>
<xml_diff>
--- a/vkr/artifacts/М24-534_НосовАИ_ВКР.docx
+++ b/vkr/artifacts/М24-534_НосовАИ_ВКР.docx
@@ -2294,7 +2294,7 @@
         </w:numPr>
       </w:pPr>
       <w:r>
-        <w:t>Обосновать выбор bi-encoder архитектуры на базе Sentence-BERT для построения семантических представлений текстов.</w:t>
+        <w:t>Обосновать выбор архитектуры независимого энкодера (bi-encoder) на базе Sentence-BERT для построения семантических представлений текстов.</w:t>
       </w:r>
     </w:p>
     <w:p ns2:paraId="747D0FB7" ns2:textId="77777777">
@@ -2349,7 +2349,7 @@
         </w:rPr>
       </w:pPr>
       <w:r>
-        <w:t>Проверить возможность интеграции разработанного модуля с тестовым контуром ATS Reqcore и оценить практическую эффективность использования bi-encoder подхода для предварительного отбора кандидатов.</w:t>
+        <w:t>Проверить возможность интеграции разработанного модуля с тестовым контуром ATS Reqcore и оценить практическую эффективность использования подхода независимого энкодера (bi-encoder) для предварительного отбора кандидатов.</w:t>
       </w:r>
     </w:p>
     <w:p ns2:paraId="5D6DAB4C" ns2:textId="30E0C0D0">
@@ -2382,7 +2382,7 @@
         </w:rPr>
       </w:pPr>
       <w:r>
-        <w:t xml:space="preserve">Научная новизна работы заключается в адаптации bi-encoder подхода к задаче сопоставления русскоязычных вакансий и резюме на основе исторических HR-событий, а также в экспериментальной проверке качества такого подхода на сформированном корпусе пар «вакансия–резюме». В отличие от простого поиска по ключевым словам, предлагаемый подход использует семантические векторные представления текстов и позволяет оценивать </w:t>
+        <w:t xml:space="preserve">Научная новизна работы заключается в адаптации подхода независимого энкодера (bi-encoder) к задаче сопоставления русскоязычных вакансий и резюме на основе исторических HR-событий, а также в экспериментальной проверке качества такого подхода на сформированном корпусе пар «вакансия–резюме». В отличие от простого поиска по ключевым словам, предлагаемый подход использует семантические векторные представления текстов и позволяет оценивать </w:t>
       </w:r>
       <w:r>
         <w:lastRenderedPageBreak/>
@@ -2397,7 +2397,7 @@
         </w:rPr>
       </w:pPr>
       <w:r>
-        <w:t>Теоретическая значимость работы состоит в систематизации подходов к семантическому ранжированию кандидатов, рассмотрении применимости методов Learning to Rank, BERT и Sentence-BERT к задаче рекрутмента, а также в определении ограничений bi-encoder архитектуры при использовании в ATS-сценариях. В работе отдельно фиксируются границы применимости разработанного решения: текущий прототип предназначен для числового семантического скоринга и предварительного отбора кандидатов, но не заменяет полноценную экспертную или LLM-интерпретацию причин соответствия кандидата вакансии.</w:t>
+        <w:t>Теоретическая значимость работы состоит в систематизации подходов к семантическому ранжированию кандидатов, рассмотрении применимости методов Learning to Rank, BERT и Sentence-BERT к задаче рекрутмента, а также в определении ограничений архитектуры независимого энкодера (bi-encoder) при использовании в ATS-сценариях. В работе отдельно фиксируются границы применимости разработанного решения: текущий прототип предназначен для числового семантического скоринга и предварительного отбора кандидатов, но не заменяет полноценную экспертную или LLM-интерпретацию причин соответствия кандидата вакансии.</w:t>
       </w:r>
     </w:p>
     <w:p ns2:paraId="2F2DCE77" ns2:textId="0891AB48">
@@ -2419,7 +2419,7 @@
         </w:rPr>
       </w:pPr>
       <w:r>
-        <w:t>Методологическую основу работы составляют методы обработки естественного языка, нейросетевые модели контекстных представлений, подходы к обучению ранжированию, методы оценки качества ранжирования, а также практики проектирования программных API и ML-пайплайнов. В качестве базовой архитектуры используется bi-encoder модель, формирующая независимые эмбеддинги вакансии и резюме с последующим вычислением косинусной меры сходства.</w:t>
+        <w:t>Методологическую основу работы составляют методы обработки естественного языка, нейросетевые модели контекстных представлений, подходы к обучению ранжированию, методы оценки качества ранжирования, а также практики проектирования программных API и ML-пайплайнов. В качестве базовой архитектуры используется модель независимого энкодера (bi-encoder), формирующая независимые эмбеддинги вакансии и резюме с последующим вычислением косинусной меры сходства.</w:t>
       </w:r>
     </w:p>
     <w:p ns2:paraId="0E47269C" ns2:textId="6D1FA12F">
@@ -2427,7 +2427,7 @@
         <w:keepNext/>
       </w:pPr>
       <w:r>
-        <w:t>Работа состоит из введения, четырех разделов, заключения и списка использованных источников. В первом разделе рассматриваются предметная область рекрутмента, ATS-системы, методы NLP и архитектуры семантического ранжирования. Во втором разделе описываются проектирование данных, архитектура обработки и интеграция с ATS. В третьем разделе приводится описание реализации модуля семантического ранжирования, подготовки обучающих данных, дообучения модели и API-сервиса. В четвертом разделе выполняется экспериментальная оценка качества модели, рассматривается интеграция с Reqcore и анализируется практическая эффективность применения bi-encoder подхода. В заключении формулируются основные результаты работы, ограничения текущей реализации и направления дальнейшего развития.</w:t>
+        <w:t>Работа состоит из введения, четырех разделов, заключения и списка использованных источников. В первом разделе рассматриваются предметная область рекрутмента, ATS-системы, методы NLP и архитектуры семантического ранжирования. Во втором разделе описываются проектирование данных, архитектура обработки и интеграция с ATS. В третьем разделе приводится описание реализации модуля семантического ранжирования, подготовки обучающих данных, дообучения модели и API-сервиса. В четвертом разделе выполняется экспериментальная оценка качества модели, рассматривается интеграция с Reqcore и анализируется практическая эффективность применения подхода независимого энкодера (bi-encoder). В заключении формулируются основные результаты работы, ограничения текущей реализации и направления дальнейшего развития.</w:t>
       </w:r>
       <w:r>
         <w:br w:type="page"/>
@@ -2855,12 +2855,12 @@
     </w:p>
     <w:p ns2:paraId="500E1B06" ns2:textId="77777777">
       <w:r>
-        <w:t>При решении задач семантического сопоставления пар «вакансия–резюме» важнейшим архитектурным решением является выбор между перекрестным энкодером (cross-encoder) и архитектурой на основе би-энкодера (bi-encoder). Перекрестный энкодер производит совместную контекстную обработку пары текстов сквозь всю сеть, требуя высоких вычислительных затрат на формирование предсказания. Би-энкодер генерирует независимые семантические вложения для каждого текста, после чего сравнивает их с помощью стандартной косинусной меры сходства или скалярного произведения. В основополагающей статье по Sentence-BERT (SBERT) подробно раскрыто ограничение перекрестных энкодеров: при использовании классического BERT попарное вычисление мер близости внутри большой базы приводит к непомерно высокому числу циклов инференса. Модели семейства SBERT модифицируют BERT в сиамскую или триплетную архитектуру для генерации оптимизированных вложений предложений, сравнимых напрямую. Это кардинально снижает вычислительные издержки вывода с сохранением высокого качества на бенчмарках семантического сходства текста [6].</w:t>
+        <w:t>При решении задач семантического сопоставления пар «вакансия–резюме» важнейшим архитектурным решением является выбор между перекрестным энкодером (cross-encoder) и архитектурой на основе независимого энкодера (bi-encoder). Перекрестный энкодер производит совместную контекстную обработку пары текстов сквозь всю сеть, требуя высоких вычислительных затрат на формирование предсказания. Би-энкодер генерирует независимые семантические вложения для каждого текста, после чего сравнивает их с помощью стандартной косинусной меры сходства или скалярного произведения. В основополагающей статье по Sentence-BERT (SBERT) подробно раскрыто ограничение перекрестных энкодеров: при использовании классического BERT попарное вычисление мер близости внутри большой базы приводит к непомерно высокому числу циклов инференса. Модели семейства SBERT модифицируют BERT в сиамскую или триплетную архитектуру для генерации оптимизированных вложений предложений, сравнимых напрямую. Это кардинально снижает вычислительные издержки вывода с сохранением высокого качества на бенчмарках семантического сходства текста [6].</w:t>
       </w:r>
     </w:p>
     <w:p ns2:paraId="482F90AB" ns2:textId="77777777">
       <w:r>
-        <w:t xml:space="preserve">В сценарии разработки для ATS вышеупомянутые выводы делают рациональной реализацию архитектуры двухступенчатого ранжирования. Первая ступень — стадия выборки (recall), основанная на поиске по плотным вложениям через би-энкодер для быстрого отбора топ-N кандидатов из глобальной базы. Вторая ступень — стадия переранжирования (re-rank), которая может осуществляться более ресурсоемкой моделью перекрестного энкодера либо строиться как отдельная LTR-надстройка над широким пулом признаков. Подобная логика построения конвейера </w:t>
+        <w:t xml:space="preserve">В сценарии разработки для ATS вышеупомянутые выводы делают рациональной реализацию архитектуры двухступенчатого ранжирования. Первая ступень — стадия выборки (recall), основанная на поиске по плотным вложениям через независимый энкодер для быстрого отбора топ-N кандидатов из глобальной базы. Вторая ступень — стадия переранжирования (re-rank), которая может осуществляться более ресурсоемкой моделью перекрестного энкодера либо строиться как отдельная LTR-надстройка над широким пулом признаков. Подобная логика построения конвейера </w:t>
       </w:r>
       <w:commentRangeStart w:id="27"/>
       <w:r>
@@ -4127,12 +4127,12 @@
     </w:p>
     <w:p ns2:paraId="5A8EFF4B" ns2:textId="5471AEAC">
       <w:r>
-        <w:t>Альтернативный путь интеграции реализован как ветка `provider === biencoder` в том же файле `analyze.post.ts`. В этой ветке Reqcore не вызывает LLM-провайдер и не использует `scoreApplication()`. Вместо этого обработчик обращается к локальной функции `scoreWithBiEncoder()`, которая читает `BIENCODER_URL` из окружения и отправляет HTTP POST на Python-микросервис `experiments/scripts/11_api_server.py` по маршруту `/score` с телом `{ vacancy_text, candidate_text }`. Python-сервис загружает `ATSRanker` и напрямую вычисляет cosine similarity между эмбеддингом вакансии и эмбеддингом одного резюме, после чего возвращает `match_score`. Затем `analyze.post.ts` линейно отображает этот score из диапазона `[-1, 1]` в шкалу `0..100` и записывает результат в `application.score`. Для этой ветки массив `evaluations` остается пустым, а записи в `criterion_score` не создаются, поскольку bi-encoder путь в текущем коде предназначен для числового pre-ranking или альтернативного coarse scoring, а не для замены полного критериального LLM-анализа.</w:t>
+        <w:t>Альтернативный путь интеграции реализован как ветка `provider === biencoder` в том же файле `analyze.post.ts`. В этой ветке Reqcore не вызывает LLM-провайдер и не использует `scoreApplication()`. Вместо этого обработчик обращается к локальной функции `scoreWithBiEncoder()`, которая читает `BIENCODER_URL` из окружения и отправляет HTTP POST на Python-микросервис `experiments/scripts/11_api_server.py` по маршруту `/score` с телом `{ vacancy_text, candidate_text }`. Python-сервис загружает `ATSRanker` и напрямую вычисляет cosine similarity между эмбеддингом вакансии и эмбеддингом одного резюме, после чего возвращает `match_score`. Затем `analyze.post.ts` линейно отображает этот score из диапазона `[-1, 1]` в шкалу `0..100` и записывает результат в `application.score`. Для этой ветки массив `evaluations` остается пустым, а записи в `criterion_score` не создаются, поскольку путь независимого энкодера (bi-encoder) в текущем коде предназначен для числового pre-ranking или альтернативного coarse scoring, а не для замены полного критериального LLM-анализа.</w:t>
       </w:r>
     </w:p>
     <w:p ns2:paraId="3AE4D07D" ns2:textId="77777777">
       <w:r>
-        <w:t>Следовательно, фактическая точка интеграции находится не в UI и не в клиентском коде, а в серверном маршруте `ats/reqcore/server/api/applications/[id]/analyze.post.ts`, где выбирается один из двух путей: `analyze.post.ts -&gt; scoreApplication() -&gt; provider -&gt; criterion_score -&gt; application.score` для критериального LLM-scoring и `analyze.post.ts -&gt; biencoder branch -&gt; HTTP /score -&gt; numeric score -&gt; application.score` для bi-encoder оценки. С точки зрения архитектуры bi-encoder путь следует описывать как альтернативный или предварительный путь ранжирования, пригодный для дешевого числового отбора, но не как полную замену всей LLM-логики Reqcore, поскольку в нем отсутствуют criterion-level explanations, evidence, strengths/gaps и генерация структурированной интерпретации.</w:t>
+        <w:t>Следовательно, фактическая точка интеграции находится не в UI и не в клиентском коде, а в серверном маршруте `ats/reqcore/server/api/applications/[id]/analyze.post.ts`, где выбирается один из двух путей: `analyze.post.ts -&gt; scoreApplication() -&gt; provider -&gt; criterion_score -&gt; application.score` для критериального LLM-scoring и `analyze.post.ts -&gt; biencoder branch -&gt; HTTP /score -&gt; numeric score -&gt; application.score` для оценки независимым энкодером (bi-encoder). С точки зрения архитектуры путь независимого энкодера (bi-encoder) следует описывать как альтернативный или предварительный путь ранжирования, пригодный для дешевого числового отбора, но не как полную замену всей LLM-логики Reqcore, поскольку в нем отсутствуют criterion-level explanations, evidence, strengths/gaps и генерация структурированной интерпретации.</w:t>
       </w:r>
     </w:p>
     <w:p ns2:paraId="771F28FE" ns2:textId="77777777">
@@ -4188,7 +4188,7 @@
     </w:p>
     <w:p ns2:paraId="7049BAA8" ns2:textId="77777777">
       <w:r>
-        <w:t>В реализованном контуре затронуты следующие файлы: `ats/reqcore/server/api/applications/[id]/analyze.post.ts` как основная точка маршрутизации; `ats/reqcore/server/utils/ai/scoring.ts` как LLM-scoring engine; `ats/reqcore/server/utils/ai/provider.ts` как адаптер провайдера; `ats/reqcore/server/database/schema/app.ts` как место определения таблиц `criterion_score`, `analysis_run` и поля `application.score`; `experiments/scripts/11_api_server.py` как Python-микросервис bi-encoder scoring. Именно эти файлы образуют фактическую интеграционную поверхность между Reqcore и модулем ML-ранжирования.</w:t>
+        <w:t>В реализованном контуре затронуты следующие файлы: `ats/reqcore/server/api/applications/[id]/analyze.post.ts` как основная точка маршрутизации; `ats/reqcore/server/utils/ai/scoring.ts` как LLM-scoring engine; `ats/reqcore/server/utils/ai/provider.ts` как адаптер провайдера; `ats/reqcore/server/database/schema/app.ts` как место определения таблиц `criterion_score`, `analysis_run` и поля `application.score`; `experiments/scripts/11_api_server.py` как Python-микросервис скоринга независимым энкодером (bi-encoder). Именно эти файлы образуют фактическую интеграционную поверхность между Reqcore и модулем ML-ранжирования.</w:t>
       </w:r>
       <w:r>
         <w:br w:type="page"/>
@@ -4506,7 +4506,7 @@
         <w:ind w:firstLine="0"/>
       </w:pPr>
       <w:r>
-        <w:t>Таблица 2 – Архитектурные и конфигурационные параметры bi-encoder модели</w:t>
+        <w:t>Таблица 2 – Архитектурные и конфигурационные параметры модели независимого энкодера (bi-encoder)</w:t>
       </w:r>
     </w:p>
     <w:tbl>
@@ -5546,7 +5546,7 @@
     </w:tbl>
     <w:p ns2:paraId="2F713C77" ns2:textId="77777777">
       <w:r>
-        <w:t>Обучение выполняется как контрастивное дообучение би-энкодера на парах «резюме - вакансия». После исправления подготовки данных сэмплирование выполняется от HR-событий к связанным резюме и вакансиям: скрипт `experiments/scripts/01_sample_and_profile_data.py` читает первоисточник `data/_/dwh_dwh_hr_received_resume_event_ods.tsv`, отбирает только явно интерпретируемые статусы и затем потоково извлекает соответствующие строки из raw-таблиц резюме и вакансий.</w:t>
+        <w:t>Обучение выполняется как контрастивное дообучение независимого энкодера на парах «резюме - вакансия». После исправления подготовки данных сэмплирование выполняется от HR-событий к связанным резюме и вакансиям: скрипт `experiments/scripts/01_sample_and_profile_data.py` читает первоисточник `data/_/dwh_dwh_hr_received_resume_event_ods.tsv`, отбирает только явно интерпретируемые статусы и затем потоково извлекает соответствующие строки из raw-таблиц резюме и вакансий.</w:t>
       </w:r>
     </w:p>
     <w:p ns2:paraId="26296A70" ns2:textId="77777777">
@@ -7991,7 +7991,7 @@
         <w:t>4</w:t>
       </w:r>
       <w:r>
-        <w:t xml:space="preserve"> –Значения метрик ранжирования bi-encoder модели на тестовом сплите test.tsv </w:t>
+        <w:t xml:space="preserve"> –Значения метрик ранжирования модели независимого энкодера (bi-encoder) на тестовом сплите test.tsv </w:t>
       </w:r>
     </w:p>
     <w:tbl>
@@ -8720,7 +8720,7 @@
         <w:jc w:val="left"/>
       </w:pPr>
       <w:r>
-        <w:t>Модуль оценивался в формате офлайн-валидации на пересобранном наборе данных, сформированном из первоисточников `data/source platform`. После очистки и пересборки связанных пар итоговая выборка составила `5 218` примеров, из которых `4 176` использовались для обучения, `521` для валидации и `521` для финального тестирования. В качестве базового варианта сравнивалась модель `cointegrated/rubert-tiny2` без дообучения; затем та же модель была дообучена на сформированном обучающем наборе и повторно оценена на отложенных split-файлах.</w:t>
+        <w:t>Модуль оценивался в формате офлайн-валидации на пересобранном наборе данных, сформированном из первоисточников `каталога данных агрегатора`. После очистки и пересборки связанных пар итоговая выборка составила `5 218` примеров, из которых `4 176` использовались для обучения, `521` для валидации и `521` для финального тестирования. В качестве базового варианта сравнивалась модель `cointegrated/rubert-tiny2` без дообучения; затем та же модель была дообучена на сформированном обучающем наборе и повторно оценена на отложенных split-файлах.</w:t>
       </w:r>
     </w:p>
     <w:p ns2:paraId="54FB4A69" ns2:textId="77777777">
@@ -8899,7 +8899,7 @@
     </w:p>
     <w:p ns2:paraId="53EBD429" ns2:textId="5A1E205B">
       <w:r>
-        <w:t xml:space="preserve">Дополнительно была выполнена практическая локальная проверка интеграции с Reqcore. Для этого был поднят локальный demo-стенд Reqcore через Docker Compose, Python bi-encoder сервис был запущен отдельно с указанием `MODEL_PATH`, а серверная переменная `BIENCODER_URL` была направлена на этот сервис. В результате treatment-путь `provider === biencoder` в `ats/reqcore/server/api/applications/[id]/analyze.post.ts` был реально пройден до конца: Reqcore вызвал `POST /score`, получил числовой `match_score`, преобразовал его в итоговый `application.score` и сохранил completed `analysis_run` с `provider = biencoder`, `model = cointegrated/rubert-tiny2`, `promptTokens = 0` и `completionTokens = 0`. Тем самым подтверждена не только автономная работа FastAPI-сервиса, но и его фактическое подключение к </w:t>
+        <w:t xml:space="preserve">Дополнительно была выполнена практическая локальная проверка интеграции с Reqcore. Для этого был поднят локальный demo-стенд Reqcore через Docker Compose, Python сервис независимого энкодера (bi-encoder) был запущен отдельно с указанием `MODEL_PATH`, а серверная переменная `BIENCODER_URL` была направлена на этот сервис. В результате treatment-путь `provider === biencoder` в `ats/reqcore/server/api/applications/[id]/analyze.post.ts` был реально пройден до конца: Reqcore вызвал `POST /score`, получил числовой `match_score`, преобразовал его в итоговый `application.score` и сохранил completed `analysis_run` с `provider = biencoder`, `model = cointegrated/rubert-tiny2`, `promptTokens = 0` и `completionTokens = 0`. Тем самым подтверждена не только автономная работа FastAPI-сервиса, но и его фактическое подключение к </w:t>
       </w:r>
       <w:r>
         <w:t>ATS-контуру Reqcore</w:t>
@@ -8919,7 +8919,7 @@
       </w:r>
       <w:r>
         <w:lastRenderedPageBreak/>
-        <w:t>отдельного production-контура аудита на независимых тестовых корпусах русского языка. Реально реализованный и проверенный контур ограничивается bi-encoder микросервисом, in-memory candidate pool для ranking API, Reqcore-интеграцией через `BIENCODER_URL` и локальным E2E/smoke-тестированием этой связки.</w:t>
+        <w:t>отдельного production-контура аудита на независимых тестовых корпусах русского языка. Реально реализованный и проверенный контур ограничивается микросервисом независимого энкодера (bi-encoder), in-memory candidate pool для ranking API, Reqcore-интеграцией через `BIENCODER_URL` и локальным E2E/smoke-тестированием этой связки.</w:t>
       </w:r>
     </w:p>
     <w:p ns2:paraId="32742863" ns2:textId="77777777">
@@ -9576,7 +9576,7 @@
         </w:rPr>
       </w:pPr>
       <w:r>
-        <w:t>Стоимость bi-encoder scoring устроена иначе: `ATSRanker` не вызывает внешний LLM API, а локально кодирует тексты через `SentenceTransformer`, считает `util.cos_sim` и выбирает `top_k` через `torch.topk`. Поэтому внешний API-cost для одного bi-encoder ranking request равен:</w:t>
+        <w:t>Стоимость скоринга независимым энкодером (bi-encoder) устроена иначе: `ATSRanker` не вызывает внешний LLM API, а локально кодирует тексты через `SentenceTransformer`, считает `util.cos_sim` и выбирает `top_k` через `torch.topk`. Поэтому внешний API-cost для одного запроса ранжирования независимым энкодером (bi-encoder) равен:</w:t>
       </w:r>
     </w:p>
     <w:p ns2:paraId="34E52D02" ns2:textId="357239D6">
@@ -9701,7 +9701,7 @@
         </w:rPr>
       </w:pPr>
       <w:r>
-        <w:t>Инфраструктурная стоимость bi-encoder зависит от выбранного размещения и не может быть выведена из token pricing. Ее корректная формула:</w:t>
+        <w:t>Инфраструктурная стоимость стоимость независимого энкодера (bi-encoder) зависит от выбранного размещения и не может быть выведена из token pricing. Ее корректная формула:</w:t>
       </w:r>
     </w:p>
     <w:p ns2:paraId="607CAC27" ns2:textId="2BF1C6B3">
@@ -9946,7 +9946,7 @@
     </w:p>
     <w:p ns2:paraId="51A14194" ns2:textId="77777777">
       <w:r>
-        <w:t>где `N` - число кандидатов в пуле, `L_bi(N)` - задержка локального scoring-запроса в секундах, `C_cpu_hour` - стоимость CPU-инстанса в долларах за час. В текущей работе `L_bi(N)` и `C_cpu_hour` не считаются production-измерениями: production benchmark с фиксированным сервером, нагрузкой и SLA не выполнялся. Поэтому для bi-encoder в разделе фиксируется только архитектурное отличие: он устраняет зависимость от внешнего LLM API на этапе первичного ранжирования, но требует локального CPU/RAM ресурса.</w:t>
+        <w:t>где `N` - число кандидатов в пуле, `L_bi(N)` - задержка локального scoring-запроса в секундах, `C_cpu_hour` - стоимость CPU-инстанса в долларах за час. В текущей работе `L_bi(N)` и `C_cpu_hour` не считаются production-измерениями: production benchmark с фиксированным сервером, нагрузкой и SLA не выполнялся. Поэтому для независимого энкодера (bi-encoder) в разделе фиксируется только архитектурное отличие: он устраняет зависимость от внешнего LLM API на этапе первичного ранжирования, но требует локального CPU/RAM ресурса.</w:t>
       </w:r>
     </w:p>
     <w:p ns2:paraId="325DBE3B" ns2:textId="77777777"/>
@@ -9957,7 +9957,7 @@
         </w:rPr>
       </w:pPr>
       <w:r>
-        <w:t>Формула top-K pre-ranking явно показывает экономический смысл bi-encoder как первого этапа. Если полный LLM scoring выполняется для всех `N` заявок, то:</w:t>
+        <w:t>Формула top-K pre-ranking явно показывает экономический смысл независимого энкодера (bi-encoder) как первого этапа. Если полный LLM scoring выполняется для всех `N` заявок, то:</w:t>
       </w:r>
     </w:p>
     <w:p ns2:paraId="075B2D0A" ns2:textId="0678009A">
@@ -10142,7 +10142,7 @@
         </w:rPr>
       </w:pPr>
       <w:r>
-        <w:t>Если bi-encoder сначала выбирает `K` кандидатов, а LLM используется только для объяснимого scoring или ручной проверки top-K, то:</w:t>
+        <w:t>Если независимый энкодер (bi-encoder) сначала выбирает `K` кандидатов, а LLM используется только для объяснимого scoring или ручной проверки top-K, то:</w:t>
       </w:r>
     </w:p>
     <w:p ns2:paraId="22F5C035" ns2:textId="269D7E6B">
@@ -11069,7 +11069,7 @@
         </w:rPr>
       </w:pPr>
       <w:r>
-        <w:t>Для bi-encoder scoring задержка определяется локальным инференсом:</w:t>
+        <w:t>Для скоринга независимым энкодером (bi-encoder) задержка определяется локальным инференсом:</w:t>
       </w:r>
     </w:p>
     <w:p ns2:paraId="06CAB0E4" ns2:textId="438F409A">
@@ -11748,7 +11748,7 @@
         </w:rPr>
       </w:pPr>
       <w:r>
-        <w:t>В ходе работы был разработан и проверен прототип модуля семантического сопоставления пары «вакансия–резюме» для интеграции в ATS-систему. Основой решения стала bi-encoder архитектура на базе cointegrated/rubert-tiny2, дообученная на корпусе связанных HR-событий. Для подготовки данных были выполнены фильтрация явно интерпретируемых статусов, деидентификация текстов, формирование unified-представлений резюме и вакансий, а также построение train/val/test split.</w:t>
+        <w:t>В ходе работы был разработан и проверен прототип модуля семантического сопоставления пары «вакансия–резюме» для интеграции в ATS-систему. Основой решения стала архитектура независимого энкодера (bi-encoder) на базе cointegrated/rubert-tiny2, дообученная на корпусе связанных HR-событий. Для подготовки данных были выполнены фильтрация явно интерпретируемых статусов, деидентификация текстов, формирование unified-представлений резюме и вакансий, а также построение train/val/test split.</w:t>
       </w:r>
     </w:p>
     <w:p ns2:paraId="632A2732" ns2:textId="7AA56A26">

</xml_diff>

<commit_message>
Replace embedding and LTR anglicisms in ranking comparison.
Use Russian vector-representation and learning-to-rank wording in thesis text and DOCX.

Co-authored-by: Cursor <cursoragent@cursor.com>
</commit_message>
<xml_diff>
--- a/vkr/artifacts/М24-534_НосовАИ_ВКР.docx
+++ b/vkr/artifacts/М24-534_НосовАИ_ВКР.docx
@@ -8714,7 +8714,7 @@
     </w:p>
     <w:p ns2:paraId="5E3C6997" ns2:textId="77777777">
       <w:r>
-        <w:t>Перед интерпретацией экспериментальных метрик важно зафиксировать, с какими классами ранжирующих систем сопоставляется реализованный подход на базе двунаправленного кодировщика представлений на основе трансформера (Bidirectional Encoder Representations from Transformers), модели эмбеддингов предложений (Sentence Bidirectional Encoder Representations from Transformers) и архитектуры двойного кодировщика (dual encoder architecture). В задаче ATS описание вакансии фактически играет роль поискового запроса, а резюме кандидатов — роль документов, которые необходимо упорядочить по степени релевантности. Поэтому естественной точкой отсчета являются классические методы информационного поиска: векторная модель, TF-IDF, BM25, вероятностные модели релевантности, а также методы обучения ранжированию над заранее рассчитанными признаками [8, 11, 25, 26].</w:t>
+        <w:t>Перед интерпретацией экспериментальных метрик важно зафиксировать, с какими классами ранжирующих систем сопоставляется реализованный подход на базе двунаправленного кодировщика представлений на основе трансформера (Bidirectional Encoder Representations from Transformers), модели векторных представлений предложений (Sentence Bidirectional Encoder Representations from Transformers) и архитектуры двойного кодировщика (dual encoder architecture). В задаче ATS описание вакансии фактически играет роль поискового запроса, а резюме кандидатов — роль документов, которые необходимо упорядочить по степени релевантности. Поэтому естественной точкой отсчета являются классические методы информационного поиска: векторная модель, TF-IDF, BM25, вероятностные модели релевантности, а также методы обучения ранжированию над заранее рассчитанными признаками [8, 11, 25, 26].</w:t>
       </w:r>
     </w:p>
     <w:p ns2:paraId="5E3C6997" ns2:textId="77777777">
@@ -8724,12 +8724,12 @@
     </w:p>
     <w:p ns2:paraId="5E3C6997" ns2:textId="77777777">
       <w:r>
-        <w:t>Подход на основе двунаправленного кодировщика (Bidirectional Encoder Representations from Transformers) отличается от этих методов тем, что формирует контекстные плотные представления текста. В варианте с моделью эмбеддингов предложений (Sentence Bidirectional Encoder Representations from Transformers) вакансия и резюме кодируются независимо, после чего их близость вычисляется как сходство эмбеддингов [5, 6]. Для данной работы это принципиально, поскольку реализованная архитектура двойного кодировщика (dual encoder architecture) на базе cointegrated/rubert-tiny2 предназначена не для поиска буквальных совпадений, а для получения семантического score пары «вакансия–резюме», который может быть дообучен на исторических HR-событиях целевого корпуса.</w:t>
+        <w:t>Подход на основе двунаправленного кодировщика (Bidirectional Encoder Representations from Transformers) отличается от этих методов тем, что формирует контекстные плотные представления текста. В варианте с моделью векторных представлений предложений (Sentence Bidirectional Encoder Representations from Transformers) вакансия и резюме кодируются независимо, после чего их близость вычисляется как сходство векторных представлений [5, 6]. Для данной работы это принципиально, поскольку реализованная архитектура двойного кодировщика (dual encoder architecture) на базе cointegrated/rubert-tiny2 предназначена не для поиска буквальных совпадений, а для получения семантического score пары «вакансия–резюме», который может быть дообучен на исторических HR-событиях целевого корпуса.</w:t>
       </w:r>
     </w:p>
     <w:p ns2:paraId="5E3C6997" ns2:textId="77777777">
       <w:r>
-        <w:t>Ссылочные методы, например PageRank, в рассматриваемой постановке имеют меньшую практическую роль: они естественны для веб-графов и сетей цитирования, но не описывают напрямую смысловое соответствие вакансии и резюме [27]. Напротив, классические Learning to Rank методы, включая RankNet, LambdaMART и градиентный бустинг для ранжирования, являются логичным направлением дальнейшего развития [8, 9, 28]. При наличии достаточного числа списков кандидатов и градуированных оценок они могут объединить BM25-score, семантический показатель, полученный архитектурой двойного кодировщика (dual encoder architecture), структурные признаки профиля и поведенческие сигналы ATS в единую ранжирующую функцию. Поэтому выбор двунаправленного кодировщика (Bidirectional Encoder Representations from Transformers) и модели эмбеддингов предложений (Sentence Bidirectional Encoder Representations from Transformers) в текущей реализации следует понимать не как отказ от классического информационного поиска, а как получение и экспериментальную проверку воспроизводимого семантического показателя для русскоязычных пар «вакансия–резюме»; построение полноценного гибридного ранжировщика с обучением по ранжирующим метрикам вынесено на следующий этап и предполагает использование этого показателя как одного из входных признаков.</w:t>
+        <w:t>Ссылочные методы, например PageRank, в рассматриваемой постановке имеют меньшую практическую роль: они естественны для веб-графов и сетей цитирования, но не описывают напрямую смысловое соответствие вакансии и резюме [27]. Напротив, классические методы обучения ранжированию (learning to rank), включая RankNet, LambdaMART и градиентный бустинг для ранжирования, являются логичным направлением дальнейшего развития [8, 9, 28]. При наличии достаточного числа списков кандидатов и градуированных оценок они могут объединить BM25-score, семантический показатель, полученный архитектурой двойного кодировщика (dual encoder architecture), структурные признаки профиля и поведенческие сигналы ATS в единую ранжирующую функцию. Поэтому выбор двунаправленного кодировщика (Bidirectional Encoder Representations from Transformers) и модели векторных представлений предложений (Sentence Bidirectional Encoder Representations from Transformers) в текущей реализации следует понимать не как отказ от классического информационного поиска, а как получение и экспериментальную проверку воспроизводимого семантического показателя для русскоязычных пар «вакансия–резюме»; построение полноценной гибридной модели ранжирования с обучением ранжированию (learning to rank) вынесено на следующий этап и предполагает использование этого показателя как одного из входных признаков.</w:t>
       </w:r>
     </w:p>
     <w:p ns2:paraId="4EABBBF1" ns2:textId="77777777">

</xml_diff>

<commit_message>
Clarify VKR chapter summary terminology
</commit_message>
<xml_diff>
--- a/vkr/artifacts/М24-534_НосовАИ_ВКР.docx
+++ b/vkr/artifacts/М24-534_НосовАИ_ВКР.docx
@@ -1935,228 +1935,27 @@
         </w:rPr>
       </w:pPr>
       <w:r>
+        <w:t>Во второй главе проектируется контур обработки данных вакансий и резюме, а также механизм интеграции, то есть HTTP-взаимодействие отдельного сервиса ранжирования с серверным ядром системы управления подбором персонала ATS Reqcore. Описываются сбор, очистка и разметка данных вакансий и резюме, архитектура конвейера предварительной обработки (preprocessing pipeline), модуль вычисления семантической близости пары «вакансия–резюме», программный интерфейс приложения (Application Programming Interface, API) и связь bi-encoder сервиса с ядром ATS Reqcore.</w:t>
+      </w:r>
+    </w:p>
+    <w:p ns2:paraId="524B8A01" ns2:textId="6A3D9E3A">
+      <w:pPr>
         <w:rPr>
           <w:lang w:val="ru-RU"/>
         </w:rPr>
-        <w:t xml:space="preserve">Во второй главе проектируется контур обработки данных и интеграции с </w:t>
-      </w:r>
-      <w:r>
-        <w:rPr>
-          <w:lang w:val="en-US"/>
-        </w:rPr>
-        <w:t>ATS</w:t>
-      </w:r>
-      <w:r>
+      </w:pPr>
+      <w:r>
+        <w:t>В третьей главе описывается разработка программного модуля семантического ранжирования кандидатов для пары «вакансия–резюме». Приводятся сведения о формировании обучающих пар «текст вакансии — текст резюме» с метками релевантности, дообучении модели «RuBERT Tiny 2» (`cointegrated/rubert-tiny2`) для задачи семантического сопоставления, составе сохраненной директории модели (`config.json`, `tokenizer.json`, `modules.json`, `1_Pooling/config.json`), гиперпараметрах обучения, устройстве класса ранжирования под названием `ATSRanker` и сервисе ранжирования кандидатов на базе Python-фреймворка `FastAPI`.</w:t>
+      </w:r>
+    </w:p>
+    <w:p ns2:paraId="340201F2" ns2:textId="58EC159F">
+      <w:pPr>
         <w:rPr>
           <w:lang w:val="ru-RU"/>
         </w:rPr>
-        <w:t xml:space="preserve">. Описываются сбор, очистка и разметка данных вакансий и резюме, архитектура пайплайна предварительной обработки, модуль семантического анализа, </w:t>
-      </w:r>
-      <w:r>
-        <w:rPr>
-          <w:lang w:val="en-US"/>
-        </w:rPr>
-        <w:t>API</w:t>
-      </w:r>
-      <w:r>
-        <w:rPr>
-          <w:lang w:val="ru-RU"/>
-        </w:rPr>
-        <w:t xml:space="preserve">-интерфейс и связь </w:t>
-      </w:r>
-      <w:r>
-        <w:rPr>
-          <w:lang w:val="en-US"/>
-        </w:rPr>
-        <w:t>bi</w:t>
-      </w:r>
-      <w:r>
-        <w:rPr>
-          <w:lang w:val="ru-RU"/>
-        </w:rPr>
-        <w:t>-</w:t>
-      </w:r>
-      <w:r>
-        <w:rPr>
-          <w:lang w:val="en-US"/>
-        </w:rPr>
-        <w:t>encoder</w:t>
-      </w:r>
-      <w:r>
-        <w:rPr>
-          <w:lang w:val="ru-RU"/>
-        </w:rPr>
-        <w:t xml:space="preserve"> сервиса с ядром </w:t>
-      </w:r>
-      <w:r>
-        <w:rPr>
-          <w:lang w:val="en-US"/>
-        </w:rPr>
-        <w:t>ATS</w:t>
-      </w:r>
-      <w:r>
-        <w:rPr>
-          <w:lang w:val="ru-RU"/>
-        </w:rPr>
-        <w:t xml:space="preserve"> </w:t>
-      </w:r>
-      <w:r>
-        <w:rPr>
-          <w:lang w:val="en-US"/>
-        </w:rPr>
-        <w:t>Reqcore</w:t>
-      </w:r>
-      <w:r>
-        <w:rPr>
-          <w:lang w:val="ru-RU"/>
-        </w:rPr>
-        <w:t>.</w:t>
-      </w:r>
-    </w:p>
-    <w:p ns2:paraId="524B8A01" ns2:textId="6A3D9E3A">
-      <w:pPr>
-        <w:rPr>
-          <w:lang w:val="ru-RU"/>
-        </w:rPr>
-      </w:pPr>
-      <w:r>
-        <w:rPr>
-          <w:lang w:val="ru-RU"/>
-        </w:rPr>
-        <w:t xml:space="preserve">В третьей главе описывается практическая реализация модуля семантического ранжирования. Приводятся сведения о подготовке обучающих пар, дообучении модели </w:t>
-      </w:r>
-      <w:r>
-        <w:rPr>
-          <w:lang w:val="en-US"/>
-        </w:rPr>
-        <w:t>cointegrated</w:t>
-      </w:r>
-      <w:r>
-        <w:rPr>
-          <w:lang w:val="ru-RU"/>
-        </w:rPr>
-        <w:t>/</w:t>
-      </w:r>
-      <w:r>
-        <w:rPr>
-          <w:lang w:val="en-US"/>
-        </w:rPr>
-        <w:t>rubert</w:t>
-      </w:r>
-      <w:r>
-        <w:rPr>
-          <w:lang w:val="ru-RU"/>
-        </w:rPr>
-        <w:t>-</w:t>
-      </w:r>
-      <w:r>
-        <w:rPr>
-          <w:lang w:val="en-US"/>
-        </w:rPr>
-        <w:t>tiny</w:t>
-      </w:r>
-      <w:r>
-        <w:rPr>
-          <w:lang w:val="ru-RU"/>
-        </w:rPr>
-        <w:t xml:space="preserve">2, структуре сохраненного артефакта, гиперпараметрах обучения, реализации класса </w:t>
-      </w:r>
-      <w:r>
-        <w:rPr>
-          <w:lang w:val="en-US"/>
-        </w:rPr>
-        <w:t>ATSRanker</w:t>
-      </w:r>
-      <w:r>
-        <w:rPr>
-          <w:lang w:val="ru-RU"/>
-        </w:rPr>
-        <w:t xml:space="preserve"> и </w:t>
-      </w:r>
-      <w:r>
-        <w:rPr>
-          <w:lang w:val="en-US"/>
-        </w:rPr>
-        <w:t>FastAPI</w:t>
-      </w:r>
-      <w:r>
-        <w:rPr>
-          <w:lang w:val="ru-RU"/>
-        </w:rPr>
-        <w:t>-сервиса для ранжирования кандидатов.</w:t>
-      </w:r>
-    </w:p>
-    <w:p ns2:paraId="340201F2" ns2:textId="58EC159F">
-      <w:pPr>
-        <w:rPr>
-          <w:lang w:val="ru-RU"/>
-        </w:rPr>
-      </w:pPr>
-      <w:r>
-        <w:rPr>
-          <w:lang w:val="ru-RU"/>
-        </w:rPr>
-        <w:t xml:space="preserve">В четвертой главе проводится экспериментальная оценка качества разработанного модуля. Рассматриваются метрики бинарного сопоставления и </w:t>
-      </w:r>
-      <w:r>
-        <w:rPr>
-          <w:lang w:val="en-US"/>
-        </w:rPr>
-        <w:t>ranking</w:t>
-      </w:r>
-      <w:r>
-        <w:rPr>
-          <w:lang w:val="ru-RU"/>
-        </w:rPr>
-        <w:t xml:space="preserve">-метрики, результаты сравнения базовой и дообученной модели, проверка </w:t>
-      </w:r>
-      <w:r>
-        <w:rPr>
-          <w:lang w:val="en-US"/>
-        </w:rPr>
-        <w:t>API</w:t>
-      </w:r>
-      <w:r>
-        <w:rPr>
-          <w:lang w:val="ru-RU"/>
-        </w:rPr>
-        <w:t xml:space="preserve">-интеграции с </w:t>
-      </w:r>
-      <w:r>
-        <w:rPr>
-          <w:lang w:val="en-US"/>
-        </w:rPr>
-        <w:t>Reqcore</w:t>
-      </w:r>
-      <w:r>
-        <w:rPr>
-          <w:lang w:val="ru-RU"/>
-        </w:rPr>
-        <w:t xml:space="preserve">, а также расчет практической эффективности применения </w:t>
-      </w:r>
-      <w:r>
-        <w:rPr>
-          <w:lang w:val="en-US"/>
-        </w:rPr>
-        <w:t>bi</w:t>
-      </w:r>
-      <w:r>
-        <w:rPr>
-          <w:lang w:val="ru-RU"/>
-        </w:rPr>
-        <w:t>-</w:t>
-      </w:r>
-      <w:r>
-        <w:rPr>
-          <w:lang w:val="en-US"/>
-        </w:rPr>
-        <w:t>encoder</w:t>
-      </w:r>
-      <w:r>
-        <w:rPr>
-          <w:lang w:val="ru-RU"/>
-        </w:rPr>
-        <w:t xml:space="preserve"> подхода для предварительного отбора кандидатов.</w:t>
+      </w:pPr>
+      <w:r>
+        <w:t>В четвертой главе проводится экспериментальная оценка качества модуля семантического ранжирования пары «вакансия–резюме». Рассматриваются метрики бинарного сопоставления и метрики ранжирования (ranking metrics), результаты сравнения исходной модели `cointegrated/rubert-tiny2` без дообучения с дообученной моделью, проверка интеграции программного интерфейса приложения (Application Programming Interface, API) с системой управления подбором персонала Reqcore, а также расчет эффекта от применения подхода независимого энкодера (bi-encoder) для предварительного отбора кандидатов на вакансию по временным и стоимостным показателям.</w:t>
       </w:r>
     </w:p>
     <w:p ns2:paraId="0DD8BAFF" ns2:textId="4C116553">
@@ -2229,11 +2028,7 @@
         </w:rPr>
       </w:pPr>
       <w:r>
-        <w:t xml:space="preserve">Актуальность работы обусловлена необходимостью разработки программных модулей, способных выполнять семантическое сопоставление вакансий и резюме на основе современных методов обработки естественного языка. Традиционные подходы, основанные на ключевых словах и простом совпадении терминов, не всегда позволяют корректно учитывать смысловую близость текстов, различия в формулировках требований и описаний опыта, а также неполноту данных в резюме. Использование нейросетевых моделей представления текста, в частности BERT и Sentence-BERT, позволяет перейти от лексического сравнения к сравнению плотных векторных представлений, что делает возможным более гибкое ранжирование кандидатов [5, 6]. Вместе с тем применение таких моделей в контуре ATS требует не только выбора архитектуры, но и подготовки данных, </w:t>
-      </w:r>
-      <w:r>
-        <w:lastRenderedPageBreak/>
-        <w:t>построения воспроизводимого пайплайна обучения, реализации API-интеграции и экспериментальной проверки качества.</w:t>
+        <w:t>Актуальность работы обусловлена необходимостью разработки программных модулей, способных выполнять семантическое сопоставление вакансий и резюме на основе современных методов обработки естественного языка. Традиционные подходы, основанные на ключевых словах и простом совпадении терминов, не всегда позволяют корректно учитывать смысловую близость текстов, различия в формулировках требований и описаний опыта, а также неполноту данных в резюме. Использование нейросетевых моделей представления текста, в частности BERT и Sentence-BERT, позволяет перейти от лексического сравнения к сравнению плотных векторных представлений, что делает возможным более гибкое ранжирование кандидатов [5, 6]. Вместе с тем применение таких моделей в контуре ATS требует не только выбора архитектуры, но и подготовки данных, построения воспроизводимого конвейера обучения (training pipeline), реализации интеграции через программный интерфейс приложения (Application Programming Interface, API) и экспериментальной проверки качества.</w:t>
       </w:r>
     </w:p>
     <w:p ns2:paraId="3E3867A4" ns2:textId="5359F2BC">
@@ -2333,7 +2128,7 @@
         </w:numPr>
       </w:pPr>
       <w:r>
-        <w:t>Выполнить дообучение модели на подготовленном наборе данных и провести экспериментальную оценку качества по метрикам бинарного сопоставления и ranking-метрикам.</w:t>
+        <w:t>Выполнить дообучение модели на подготовленном наборе данных и провести экспериментальную оценку качества по метрикам бинарного сопоставления и метрикам ранжирования (ranking metrics).</w:t>
       </w:r>
     </w:p>
     <w:p ns2:paraId="57A9A552" ns2:textId="3951ADBA">
@@ -2408,7 +2203,7 @@
         </w:rPr>
       </w:pPr>
       <w:r>
-        <w:t>Практическая значимость работы заключается в разработке прототипа ML-модуля, который может использоваться в ATS для предварительного ранжирования кандидатов. В рамках работы реализованы подготовка данных, дообучение модели cointegrated/rubert-tiny2, модуль ранжирования, FastAPI-сервис и интеграция с тестовым контуром ATS Reqcore. Такой модуль может применяться как первый этап отбора: он позволяет быстро получить числовую оценку соответствия кандидата вакансии и сократить число профилей, передаваемых на более дорогую экспертную или LLM-оценку.</w:t>
+        <w:t>Практическая значимость работы заключается в разработке прототипа ML-модуля, который может использоваться в ATS для предварительного ранжирования кандидатов. В рамках работы реализованы подготовка данных, дообучение модели cointegrated/rubert-tiny2, модуль ранжирования, сервис на базе Python-фреймворка FastAPI и интеграция с тестовым контуром ATS Reqcore через HTTP-вызов сервиса семантического скоринга. Такой модуль может применяться как первый этап отбора: он позволяет быстро получить числовую оценку соответствия кандидата вакансии и сократить число профилей, передаваемых на более дорогую экспертную или LLM-оценку.</w:t>
       </w:r>
     </w:p>
     <w:p ns2:paraId="0EDA70A2" ns2:textId="79E95C95">
@@ -2427,10 +2222,7 @@
         <w:keepNext/>
       </w:pPr>
       <w:r>
-        <w:t>Работа состоит из введения, четырех разделов, заключения и списка использованных источников. В первом разделе рассматриваются предметная область рекрутмента, ATS-системы, методы NLP и архитектуры семантического ранжирования. Во втором разделе описываются проектирование данных, архитектура обработки и интеграция с ATS. В третьем разделе приводится описание реализации модуля семантического ранжирования, подготовки обучающих данных, дообучения модели и API-сервиса. В четвертом разделе выполняется экспериментальная оценка качества модели, рассматривается интеграция с Reqcore и анализируется практическая эффективность применения подхода независимого энкодера (bi-encoder). В заключении формулируются основные результаты работы, ограничения текущей реализации и направления дальнейшего развития.</w:t>
-      </w:r>
-      <w:r>
-        <w:br w:type="page"/>
+        <w:t>Работа состоит из введения, четырех разделов, заключения и списка использованных источников. В первом разделе рассматриваются предметная область рекрутмента, ATS-системы, методы NLP и архитектуры семантического ранжирования. Во втором разделе описываются проектирование данных, архитектура обработки и интеграция с ATS. В третьем разделе приводится описание разработки модуля семантического ранжирования, подготовки обучающих данных, дообучения модели и сервиса на базе Python-фреймворка FastAPI. В четвертом разделе выполняется экспериментальная оценка качества модели, рассматривается интеграция с Reqcore и анализируется временной и стоимостный эффект применения подхода независимого энкодера (bi-encoder). В заключении формулируются основные результаты работы, ограничения текущей реализации и направления дальнейшего развития.</w:t>
       </w:r>
     </w:p>
     <w:p ns2:paraId="5AA0D662" ns2:textId="77777777">
@@ -7895,83 +7687,7 @@
         </w:rPr>
       </w:pPr>
       <w:r>
-        <w:t xml:space="preserve">Для проверки именно ranking-метрик был выполнен отдельный полный прогон по `data/splits/test.tsv` с группировкой по `vacancy_id`: внутри каждой вакансии резюме ранжировались по cosine score текущей fine-tuned модели. </w:t>
-      </w:r>
-      <w:r>
-        <w:rPr>
-          <w:lang w:val="en-US"/>
-        </w:rPr>
-        <w:t xml:space="preserve">Raw output </w:t>
-      </w:r>
-      <w:r>
-        <w:t>сохранен</w:t>
-      </w:r>
-      <w:r>
-        <w:rPr>
-          <w:lang w:val="en-US"/>
-        </w:rPr>
-        <w:t xml:space="preserve"> </w:t>
-      </w:r>
-      <w:r>
-        <w:t>в</w:t>
-      </w:r>
-      <w:r>
-        <w:rPr>
-          <w:lang w:val="en-US"/>
-        </w:rPr>
-        <w:t xml:space="preserve"> `experiments/results/full_test_ranking_metrics_stdout.txt`, </w:t>
-      </w:r>
-      <w:r>
-        <w:t>агрегированные</w:t>
-      </w:r>
-      <w:r>
-        <w:rPr>
-          <w:lang w:val="en-US"/>
-        </w:rPr>
-        <w:t xml:space="preserve"> </w:t>
-      </w:r>
-      <w:r>
-        <w:t>результаты</w:t>
-      </w:r>
-      <w:r>
-        <w:rPr>
-          <w:lang w:val="en-US"/>
-        </w:rPr>
-        <w:t xml:space="preserve"> </w:t>
-      </w:r>
-      <w:r>
-        <w:t>и</w:t>
-      </w:r>
-      <w:r>
-        <w:rPr>
-          <w:lang w:val="en-US"/>
-        </w:rPr>
-        <w:t xml:space="preserve"> group-level </w:t>
-      </w:r>
-      <w:r>
-        <w:t>значения</w:t>
-      </w:r>
-      <w:r>
-        <w:rPr>
-          <w:lang w:val="en-US"/>
-        </w:rPr>
-        <w:t xml:space="preserve"> - </w:t>
-      </w:r>
-      <w:r>
-        <w:t>в</w:t>
-      </w:r>
-      <w:r>
-        <w:rPr>
-          <w:lang w:val="en-US"/>
-        </w:rPr>
-        <w:t xml:space="preserve"> `experiments/results/full_test_ranking_metrics.json`. </w:t>
-      </w:r>
-      <w:r>
-        <w:t xml:space="preserve">В `test.tsv` содержится `521` пара, `423` уникальные вакансии, `510` уникальных резюме, `177` положительных и `344` отрицательных метки; пропущенных `resume_id` и `vacancy_id` относительно unified-файлов нет. При этом тестовый split разрежен: `304` вакансии не имеют positive-кандидата, только `59` вакансий имеют минимум двух кандидатов, а NDCG </w:t>
-      </w:r>
-      <w:r>
-        <w:lastRenderedPageBreak/>
-        <w:t>математически определена только для `33` вакансий, где есть хотя бы два кандидата и хотя бы один positive.</w:t>
+        <w:t>Для проверки именно метрик ранжирования (ranking metrics) был выполнен отдельный полный прогон по `data/splits/test.tsv` с группировкой по `vacancy_id`: внутри каждой вакансии резюме ранжировались по cosine score текущей fine-tuned модели. Raw output сохранен в `experiments/results/full_test_ranking_metrics_stdout.txt`, агрегированные результаты и group-level значения - в `experiments/results/full_test_ranking_metrics.json`. В `test.tsv` содержится `521` пара, `423` уникальные вакансии, `510` уникальных резюме, `177` положительных и `344` отрицательных метки; пропущенных `resume_id` и `vacancy_id` относительно unified-файлов нет. При этом тестовый split разрежен: `304` вакансии не имеют positive-кандидата, только `59` вакансий имеют минимум двух кандидатов, а NDCG математически определена только для `33` вакансий, где есть хотя бы два кандидата и хотя бы один positive.</w:t>
       </w:r>
     </w:p>
     <w:p ns2:paraId="4C1FCC99" ns2:textId="33F294B4">
@@ -8669,12 +8385,9 @@
       </w:tr>
     </w:tbl>
     <w:p ns2:paraId="1B291B46" ns2:textId="77777777">
-      <w:r>
-        <w:t xml:space="preserve">Если усреднять Precision@K по всем `423` вакансиям, включая `304` вакансии без positive-кандидата, то Precision@1 составляет `0.2813`, Precision@3 - `0.2801`, Precision@5 - `0.2801`; Recall и NDCG для negative-only групп не определены по смыслу. Поэтому в тексте работы основные ranking-метрики приводятся для вакансий с хотя бы одним </w:t>
-      </w:r>
-      <w:r>
-        <w:lastRenderedPageBreak/>
-        <w:t>релевантным кандидатом, а разреженность test split фиксируется как ограничение эксперимента.</w:t>
+      <w:pPr/>
+      <w:r>
+        <w:t>Если усреднять Precision@K по всем `423` вакансиям, включая `304` вакансии без positive-кандидата, то Precision@1 составляет `0.2813`, Precision@3 - `0.2801`, Precision@5 - `0.2801`; Recall и NDCG для negative-only групп не определены по смыслу. Поэтому в тексте работы основные метрики ранжирования (ranking metrics) приводятся для вакансий с хотя бы одним релевантным кандидатом, а разреженность test split фиксируется как ограничение эксперимента.</w:t>
       </w:r>
     </w:p>
     <w:p ns2:paraId="13080035" ns2:textId="77777777">
@@ -8697,10 +8410,9 @@
       <w:bookmarkEnd w:id="54"/>
     </w:p>
     <w:p ns2:paraId="5E3C6997" ns2:textId="77777777">
-      <w:bookmarkStart w:id="55" w:name="_iw7r6i1ciiwy" w:colFirst="0" w:colLast="0"/>
-      <w:bookmarkEnd w:id="55"/>
-      <w:r>
-        <w:t>Экспериментальная часть для текущей реализации подтверждает три факта, непосредственно связанные с кодом и данными: первое, модель после дообучения лучше разделяет положительные и отрицательные пары по косинусному сходству; второе, на полном `test.tsv` по группам `vacancy_id` измерены ranking-метрики NDCG@K, Precision@K, Recall@K и MRR; третье, обработчик `/search/rank` в коде API построен как вызов того же метода `ATSRanker.search` поверх in-memory пула кандидатов; отдельный E2E-прогон HTTP-сервера в рамках этой правки не выполнялся. При этом в коде отсутствует промышленный индекс кандидатов, отдельная векторная БД, ANN-поиск, LTR-переранжирование и fair ranking слой. Поэтому раздел экспериментальной оценки не включает неподтвержденные утверждения о задержке в миллисекундах, сокращении пула в заданное число раз или готовности к промышленному масштабированию на миллионы профилей.</w:t>
+      <w:pPr/>
+      <w:r>
+        <w:t>Экспериментальная часть для текущей реализации подтверждает три факта, непосредственно связанные с кодом и данными: первое, модель после дообучения лучше разделяет положительные и отрицательные пары по косинусному сходству; второе, на полном `test.tsv` по группам `vacancy_id` измерены метрики ранжирования (ranking metrics) NDCG@K, Precision@K, Recall@K и MRR; третье, обработчик `/search/rank` в коде API построен как вызов того же метода `ATSRanker.search` поверх in-memory пула кандидатов; отдельный E2E-прогон HTTP-сервера в рамках этой правки не выполнялся. При этом в коде отсутствует промышленный индекс кандидатов, отдельная векторная БД, ANN-поиск, LTR-переранжирование и fair ranking слой. Поэтому раздел экспериментальной оценки не включает неподтвержденные утверждения о задержке в миллисекундах, сокращении пула в заданное число раз или готовности к промышленному масштабированию на миллионы профилей.</w:t>
       </w:r>
     </w:p>
     <w:p ns2:paraId="4EABBBF1" ns2:textId="77777777">
@@ -8877,7 +8589,7 @@
         <w:jc w:val="left"/>
       </w:pPr>
       <w:r>
-        <w:t>Таким образом, в работе реально подтверждены два результата. Во-первых, дообучение `cointegrated/rubert-tiny2` на целевом наборе связанных пар заметно улучшает качество бинарного различения релевантных и нерелевантных соответствий. Во-вторых, на полном тестовом срезе модель показывает высокие ranking-метрики при сортировке кандидатов внутри вакансий. Вместе с тем эти результаты следует интерпретировать как офлайн-валидацию на исторических данных, а не как онлайн-эксперимент в рабочем контуре ATS.</w:t>
+        <w:t>Таким образом, в работе реально подтверждены два результата. Во-первых, дообучение `cointegrated/rubert-tiny2` на целевом наборе связанных пар заметно улучшает качество бинарного различения релевантных и нерелевантных соответствий. Во-вторых, на полном тестовом срезе модель показывает высокие метрики ранжирования (ranking metrics) при сортировке кандидатов внутри вакансий. Вместе с тем эти результаты следует интерпретировать как офлайн-валидацию на исторических данных, а не как онлайн-эксперимент в рабочем контуре ATS.</w:t>
       </w:r>
     </w:p>
     <w:p ns2:paraId="5D5F3ADB" ns2:textId="3A6B7152">
@@ -11787,7 +11499,7 @@
         </w:rPr>
       </w:pPr>
       <w:r>
-        <w:t>Практическая реализация включает модуль ранжирования ATSRanker и FastAPI-сервис, предоставляющий маршруты для индексации кандидатов, ранжирования кандидатского пула и вычисления score для одной пары «вакансия–резюме». Дополнительно была выполнена интеграция с тестовым контуром ATS Reqcore через ветку provider === biencoder, где результат работы модели преобразуется в числовое поле application.score.</w:t>
+        <w:t>Разработанный программный контур включает модуль ранжирования ATSRanker и сервис на базе Python-фреймворка FastAPI, предоставляющий маршруты для индексации кандидатов, ранжирования кандидатского пула и вычисления score для одной пары «вакансия–резюме». Дополнительно была выполнена интеграция с тестовым контуром ATS Reqcore через ветку provider === biencoder, где результат работы модели преобразуется в числовое поле application.score.</w:t>
       </w:r>
     </w:p>
     <w:p ns2:paraId="0B2DC5FC" ns2:textId="5EF0B305">
@@ -11797,7 +11509,7 @@
         </w:rPr>
       </w:pPr>
       <w:r>
-        <w:t>Экспериментальная часть подтвердила достижение основной цели работы: после дообучения модель существенно улучшила качество различения релевантных и нерелевантных пар по сравнению с базовой моделью без fine-tuning. Дополнительно были рассчитаны ranking-метрики по группам vacancy_id, что позволило проверить способность модели выносить релевантных кандидатов в верхнюю часть выдачи.</w:t>
+        <w:t>Экспериментальная часть подтвердила достижение основной цели работы: после дообучения модель существенно улучшила качество различения релевантных и нерелевантных пар по сравнению с исходной моделью без fine-tuning. Дополнительно были рассчитаны метрики ранжирования (ranking metrics) по группам vacancy_id, что позволило проверить способность модели выносить релевантных кандидатов в верхнюю часть выдачи.</w:t>
       </w:r>
     </w:p>
     <w:p ns2:paraId="742F6116" ns2:textId="189D8D7F">

</xml_diff>